<commit_message>
docs: add 6995 (2026 turret + live Choreo useAllianceFlipping) to aiming table and Choreo section
</commit_message>
<xml_diff>
--- a/MechaRAMS vision system/Localization-and-Trajectory-Precision-2027.docx
+++ b/MechaRAMS vision system/Localization-and-Trajectory-Precision-2027.docx
@@ -1058,7 +1058,7 @@
         <w:pStyle w:val="Heading2"/>
       </w:pPr>
       <w:r>
-        <w:t xml:space="preserve">3.4 How five teams actually aim (cross-team comparison)</w:t>
+        <w:t xml:space="preserve">3.4 How six teams actually aim (cross-team comparison)</w:t>
       </w:r>
     </w:p>
     <w:p>
@@ -1507,7 +1507,7 @@
                 <w:b w:val="false"/>
                 <w:bCs w:val="false"/>
               </w:rPr>
-              <w:t xml:space="preserve">2910 Jack in the Bot (2024)</w:t>
+              <w:t xml:space="preserve">6995 NOMAD (2026)</w:t>
             </w:r>
           </w:p>
         </w:tc>
@@ -1531,7 +1531,7 @@
                 <w:b w:val="false"/>
                 <w:bCs w:val="false"/>
               </w:rPr>
-              <w:t xml:space="preserve">Measured tag angle when visible, else global pose</w:t>
+              <w:t xml:space="preserve">Global pose (pose-fed turret)</w:t>
             </w:r>
           </w:p>
         </w:tc>
@@ -1555,7 +1555,7 @@
                 <w:b w:val="false"/>
                 <w:bCs w:val="false"/>
               </w:rPr>
-              <w:t xml:space="preserve">TURRET: turretAngle + measuredAprilTagAngle, falls back to atan2 from pose</w:t>
+              <w:t xml:space="preserve">TURRET aimed from a robotPose supplier; Choreo AutoFactory for autos</w:t>
             </w:r>
           </w:p>
         </w:tc>
@@ -1579,7 +1579,7 @@
                 <w:b w:val="false"/>
                 <w:bCs w:val="false"/>
               </w:rPr>
-              <w:t xml:space="preserve">Yes — true local + global hybrid</w:t>
+              <w:t xml:space="preserve">Turret + global pose</w:t>
             </w:r>
           </w:p>
         </w:tc>
@@ -1605,7 +1605,7 @@
                 <w:b w:val="false"/>
                 <w:bCs w:val="false"/>
               </w:rPr>
-              <w:t xml:space="preserve">1678 Citrus (2024)</w:t>
+              <w:t xml:space="preserve">2910 Jack in the Bot (2024)</w:t>
             </w:r>
           </w:p>
         </w:tc>
@@ -1629,7 +1629,7 @@
                 <w:b w:val="false"/>
                 <w:bCs w:val="false"/>
               </w:rPr>
-              <w:t xml:space="preserve">Separate vision GoalTracker + global pose estimator</w:t>
+              <w:t xml:space="preserve">Measured tag angle when visible, else global pose</w:t>
             </w:r>
           </w:p>
         </w:tc>
@@ -1653,7 +1653,7 @@
                 <w:b w:val="false"/>
                 <w:bCs w:val="false"/>
               </w:rPr>
-              <w:t xml:space="preserve">Chassis snapHeading; dedicated goal tracker is the local signal</w:t>
+              <w:t xml:space="preserve">TURRET: turretAngle + measuredAprilTagAngle, falls back to atan2 from pose</w:t>
             </w:r>
           </w:p>
         </w:tc>
@@ -1661,6 +1661,104 @@
           <w:tcPr>
             <w:tcW w:type="dxa" w:w="2300"/>
             <w:shd w:fill="FFFFFF" w:val="clear"/>
+            <w:tcMar>
+              <w:top w:type="dxa" w:w="60"/>
+              <w:left w:type="dxa" w:w="110"/>
+              <w:bottom w:type="dxa" w:w="60"/>
+              <w:right w:type="dxa" w:w="110"/>
+            </w:tcMar>
+          </w:tcPr>
+          <w:p>
+            <w:pPr>
+              <w:spacing w:after="0" w:line="252"/>
+            </w:pPr>
+            <w:r>
+              <w:rPr>
+                <w:b w:val="false"/>
+                <w:bCs w:val="false"/>
+              </w:rPr>
+              <w:t xml:space="preserve">Yes — true local + global hybrid</w:t>
+            </w:r>
+          </w:p>
+        </w:tc>
+      </w:tr>
+      <w:tr>
+        <w:tc>
+          <w:tcPr>
+            <w:tcW w:type="dxa" w:w="1450"/>
+            <w:shd w:fill="F4F8FB" w:val="clear"/>
+            <w:tcMar>
+              <w:top w:type="dxa" w:w="60"/>
+              <w:left w:type="dxa" w:w="110"/>
+              <w:bottom w:type="dxa" w:w="60"/>
+              <w:right w:type="dxa" w:w="110"/>
+            </w:tcMar>
+          </w:tcPr>
+          <w:p>
+            <w:pPr>
+              <w:spacing w:after="0" w:line="252"/>
+            </w:pPr>
+            <w:r>
+              <w:rPr>
+                <w:b w:val="false"/>
+                <w:bCs w:val="false"/>
+              </w:rPr>
+              <w:t xml:space="preserve">1678 Citrus (2024)</w:t>
+            </w:r>
+          </w:p>
+        </w:tc>
+        <w:tc>
+          <w:tcPr>
+            <w:tcW w:type="dxa" w:w="2300"/>
+            <w:shd w:fill="F4F8FB" w:val="clear"/>
+            <w:tcMar>
+              <w:top w:type="dxa" w:w="60"/>
+              <w:left w:type="dxa" w:w="110"/>
+              <w:bottom w:type="dxa" w:w="60"/>
+              <w:right w:type="dxa" w:w="110"/>
+            </w:tcMar>
+          </w:tcPr>
+          <w:p>
+            <w:pPr>
+              <w:spacing w:after="0" w:line="252"/>
+            </w:pPr>
+            <w:r>
+              <w:rPr>
+                <w:b w:val="false"/>
+                <w:bCs w:val="false"/>
+              </w:rPr>
+              <w:t xml:space="preserve">Separate vision GoalTracker + global pose estimator</w:t>
+            </w:r>
+          </w:p>
+        </w:tc>
+        <w:tc>
+          <w:tcPr>
+            <w:tcW w:type="dxa" w:w="3598"/>
+            <w:shd w:fill="F4F8FB" w:val="clear"/>
+            <w:tcMar>
+              <w:top w:type="dxa" w:w="60"/>
+              <w:left w:type="dxa" w:w="110"/>
+              <w:bottom w:type="dxa" w:w="60"/>
+              <w:right w:type="dxa" w:w="110"/>
+            </w:tcMar>
+          </w:tcPr>
+          <w:p>
+            <w:pPr>
+              <w:spacing w:after="0" w:line="252"/>
+            </w:pPr>
+            <w:r>
+              <w:rPr>
+                <w:b w:val="false"/>
+                <w:bCs w:val="false"/>
+              </w:rPr>
+              <w:t xml:space="preserve">Chassis snapHeading; dedicated goal tracker is the local signal</w:t>
+            </w:r>
+          </w:p>
+        </w:tc>
+        <w:tc>
+          <w:tcPr>
+            <w:tcW w:type="dxa" w:w="2300"/>
+            <w:shd w:fill="F4F8FB" w:val="clear"/>
             <w:tcMar>
               <w:top w:type="dxa" w:w="60"/>
               <w:left w:type="dxa" w:w="110"/>
@@ -1699,7 +1797,7 @@
         <w:t xml:space="preserve">Pattern:  </w:t>
       </w:r>
       <w:r>
-        <w:t xml:space="preserve">turret teams (2910) get the cleanest split because the turret keeps the goal in frame while the chassis does other things; chassis-aim teams either rely entirely on the global pose (6328, 1768, 3467) or bolt on a separate goal tracker (1678). In 2026 you had only the global half and no tracker — that is exactly the gap a shooter-boresight camera fills.</w:t>
+        <w:t xml:space="preserve">turret teams (2910, 6995) get the cleanest split because the turret keeps the goal in frame while the chassis does other things — though note 6995 still drives its turret from the global pose, and 2026 chassis-aim teams (6328, 1768, 3467) rely entirely on the global pose; only 1678’s older code bolts on a separate goal tracker. In 2026 you had only the global half and no tracker — that is exactly the gap a shooter-boresight camera fills.</w:t>
       </w:r>
     </w:p>
     <w:p>
@@ -2956,7 +3054,29 @@
         <w:t xml:space="preserve">AllianceFlipUtil.shouldFlip()</w:t>
       </w:r>
       <w:r>
-        <w:t xml:space="preserve">. There is no alliance-flip blocker.</w:t>
+        <w:t xml:space="preserve">. And 6995 — a 2026 turret team — makes it a one-liner: their Choreo </w:t>
+      </w:r>
+      <w:r>
+        <w:rPr>
+          <w:rFonts w:ascii="Consolas" w:cs="Consolas" w:eastAsia="Consolas" w:hAnsi="Consolas"/>
+          <w:sz w:val="19"/>
+          <w:szCs w:val="19"/>
+        </w:rPr>
+        <w:t xml:space="preserve">AutoFactory</w:t>
+      </w:r>
+      <w:r>
+        <w:t xml:space="preserve"> is constructed with </w:t>
+      </w:r>
+      <w:r>
+        <w:rPr>
+          <w:rFonts w:ascii="Consolas" w:cs="Consolas" w:eastAsia="Consolas" w:hAnsi="Consolas"/>
+          <w:sz w:val="19"/>
+          <w:szCs w:val="19"/>
+        </w:rPr>
+        <w:t xml:space="preserve">useAllianceFlipping = true</w:t>
+      </w:r>
+      <w:r>
+        <w:t xml:space="preserve"> as a single boolean argument. There is no alliance-flip blocker.</w:t>
       </w:r>
     </w:p>
     <w:p>
@@ -5492,7 +5612,7 @@
         </w:numPr>
         <w:spacing w:after="60"/>
       </w:pPr>
-      <w:hyperlink w:history="1" r:id="rIdvoexv2ft2ts03mqhflkb3">
+      <w:hyperlink w:history="1" r:id="rId2vgqj2uxpiojvpmbw2ys-">
         <w:r>
           <w:rPr>
             <w:rStyle w:val="Hyperlink"/>
@@ -5510,7 +5630,7 @@
         </w:numPr>
         <w:spacing w:after="60"/>
       </w:pPr>
-      <w:hyperlink w:history="1" r:id="rIdtdt3d8xskv4doqsip27r5">
+      <w:hyperlink w:history="1" r:id="rId7ujfjovoqpyuhmmvc-pna">
         <w:r>
           <w:rPr>
             <w:rStyle w:val="Hyperlink"/>
@@ -5528,7 +5648,7 @@
         </w:numPr>
         <w:spacing w:after="60"/>
       </w:pPr>
-      <w:hyperlink w:history="1" r:id="rId8mtggy-t9snpliipwolc0">
+      <w:hyperlink w:history="1" r:id="rIdozc5ynxveqswdtpersz-k">
         <w:r>
           <w:rPr>
             <w:rStyle w:val="Hyperlink"/>
@@ -5546,7 +5666,7 @@
         </w:numPr>
         <w:spacing w:after="60"/>
       </w:pPr>
-      <w:hyperlink w:history="1" r:id="rId0dhp3yfnl5ya4shuzpgku">
+      <w:hyperlink w:history="1" r:id="rIdegy41j8w7zizy8pykxf2x">
         <w:r>
           <w:rPr>
             <w:rStyle w:val="Hyperlink"/>
@@ -5564,7 +5684,7 @@
         </w:numPr>
         <w:spacing w:after="60"/>
       </w:pPr>
-      <w:hyperlink w:history="1" r:id="rIdiq14eqgyxoz6nu8qpgp9m">
+      <w:hyperlink w:history="1" r:id="rIdu3rg0peq7nwvlozurtwir">
         <w:r>
           <w:rPr>
             <w:rStyle w:val="Hyperlink"/>
@@ -5582,7 +5702,7 @@
         </w:numPr>
         <w:spacing w:after="60"/>
       </w:pPr>
-      <w:hyperlink w:history="1" r:id="rIdc_qfun_p-aibs3cflh3zg">
+      <w:hyperlink w:history="1" r:id="rIdifp8ljg4hznx0zvphubcy">
         <w:r>
           <w:rPr>
             <w:rStyle w:val="Hyperlink"/>
@@ -5600,7 +5720,7 @@
         </w:numPr>
         <w:spacing w:after="60"/>
       </w:pPr>
-      <w:hyperlink w:history="1" r:id="rIdtplqma2hoesp1hkq1dc1t">
+      <w:hyperlink w:history="1" r:id="rId6inujv8h4p5i5xtzt0djv">
         <w:r>
           <w:rPr>
             <w:rStyle w:val="Hyperlink"/>
@@ -5618,7 +5738,7 @@
         </w:numPr>
         <w:spacing w:after="60"/>
       </w:pPr>
-      <w:hyperlink w:history="1" r:id="rIdg3nb_lf4u5qmjudhqxyas">
+      <w:hyperlink w:history="1" r:id="rIdzy3fm6sf8ys2zigv_weql">
         <w:r>
           <w:rPr>
             <w:rStyle w:val="Hyperlink"/>
@@ -5636,7 +5756,25 @@
         </w:numPr>
         <w:spacing w:after="60"/>
       </w:pPr>
-      <w:hyperlink w:history="1" r:id="rId3sn6pftrozhflxtmbesiu">
+      <w:hyperlink w:history="1" r:id="rId1uypoziqpfw6ku5ygcumj">
+        <w:r>
+          <w:rPr>
+            <w:rStyle w:val="Hyperlink"/>
+          </w:rPr>
+          <w:t xml:space="preserve">6995 NOMAD — Robot-2026 (live Choreo AutoFactory, useAllianceFlipping=true; pose-fed turret)</w:t>
+        </w:r>
+      </w:hyperlink>
+    </w:p>
+    <w:p>
+      <w:pPr>
+        <w:pStyle w:val="ListParagraph"/>
+        <w:numPr>
+          <w:ilvl w:val="0"/>
+          <w:numId w:val="2"/>
+        </w:numPr>
+        <w:spacing w:after="60"/>
+      </w:pPr>
+      <w:hyperlink w:history="1" r:id="rIdb5awio5-gclpyvvtno7kw">
         <w:r>
           <w:rPr>
             <w:rStyle w:val="Hyperlink"/>
@@ -5654,7 +5792,7 @@
         </w:numPr>
         <w:spacing w:after="60"/>
       </w:pPr>
-      <w:hyperlink w:history="1" r:id="rIdvjgllwlur7jnfiokrsxvk">
+      <w:hyperlink w:history="1" r:id="rIdsxqtgxl6-dtc0df3isam-">
         <w:r>
           <w:rPr>
             <w:rStyle w:val="Hyperlink"/>
@@ -5672,7 +5810,7 @@
         </w:numPr>
         <w:spacing w:after="60"/>
       </w:pPr>
-      <w:hyperlink w:history="1" r:id="rIddwlj1fki2llpl3euneqv_">
+      <w:hyperlink w:history="1" r:id="rIdxll1ykibc07w2f3krv1wp">
         <w:r>
           <w:rPr>
             <w:rStyle w:val="Hyperlink"/>
@@ -5690,7 +5828,7 @@
         </w:numPr>
         <w:spacing w:after="60"/>
       </w:pPr>
-      <w:hyperlink w:history="1" r:id="rIdbqakiwmpzoe2gao4jwxtk">
+      <w:hyperlink w:history="1" r:id="rIdfoudlftey9ilvpgfhpqub">
         <w:r>
           <w:rPr>
             <w:rStyle w:val="Hyperlink"/>
@@ -5708,7 +5846,7 @@
         </w:numPr>
         <w:spacing w:after="60"/>
       </w:pPr>
-      <w:hyperlink w:history="1" r:id="rId_dw2u-psejpv9xassax0p">
+      <w:hyperlink w:history="1" r:id="rIdcxg-qpnisbkiklz7kshbl">
         <w:r>
           <w:rPr>
             <w:rStyle w:val="Hyperlink"/>

</xml_diff>